<commit_message>
Update F1 specification notes
完成 F1 核心模組與文件的一致性整理，移除過時的函式實作狀態及待確認註記，更新 Function Interface 與 Data Model 文件版次。11 個公開函式、對外契約及資料結構均維持不變。
</commit_message>
<xml_diff>
--- a/docs/data_model.docx
+++ b/docs/data_model.docx
@@ -35,7 +35,7 @@
           <w:color w:val="000000"/>
           <w:sz w:val="20"/>
         </w:rPr>
-        <w:t>校園選課與課表規劃系統  |  契約 1.0  |  文件 1.1  |  2026/10/16</w:t>
+        <w:t>校園選課與課表規劃系統  |  契約 1.0  |  文件 1.2  |  2026/10/16</w:t>
       </w:r>
     </w:p>
     <w:p>
@@ -2368,7 +2368,7 @@
           <w:color w:val="000000"/>
           <w:sz w:val="22"/>
         </w:rPr>
-        <w:t>教室完整資料模型、共用資料存取及 F2／F10 協調規格由相關成員確認；不在此文件另訂。空 changes 與相同 id 的待確認邊界，統一見介面文件第 7 節。</w:t>
+        <w:t>教室完整資料模型、共用資料存取及 F2／F10 協調規格由相關成員確認；不在此文件另訂。</w:t>
       </w:r>
     </w:p>
     <w:p>
@@ -2379,7 +2379,7 @@
           <w:color w:val="000000"/>
           <w:sz w:val="18"/>
         </w:rPr>
-        <w:t>來源：老師作業規範 F1、SDD 2.2 與 3.1、2026/10/16 已確認決策。契約版本維持 1.0，本次文件修訂為 1.1。</w:t>
+        <w:t>來源：老師作業規範 F1、SDD 2.2 與 3.1、2026/10/16 已確認決策。契約版本維持 1.0，本次文件修訂為 1.2。</w:t>
       </w:r>
     </w:p>
     <w:sectPr>

</xml_diff>